<commit_message>
court(fladistctapp4): opening-brief latex gated on the model at HEAD, docx reported (fb-595.54.39)
LaTeX breaks after a slash inside a word now (fb-595.54.82 lane 2): 603/603 lines.
docx 597/603 (Bonum's advances in LibreOffice, p20).

Co-Authored-By: Claude Opus 5.5 <noreply@anthropic.com>
</commit_message>
<xml_diff>
--- a/courts/eleventh-circuit/florida/state/fourth-district-court-of-appeal/opening-brief/usage/OUTPUT-opening-brief.docx
+++ b/courts/eleventh-circuit/florida/state/fourth-district-court-of-appeal/opening-brief/usage/OUTPUT-opening-brief.docx
@@ -6176,7 +6176,7 @@
               <w:rPr>
                 <w:u w:val="single"/>
               </w:rPr>
-              <w:t xml:space="preserve"> </w:t>
+              <w:t xml:space="preserve"> </w:t>
             </w:r>
             <w:r>
               <w:rPr>
@@ -6960,7 +6960,7 @@
               <w:rPr>
                 <w:u w:val="single"/>
               </w:rPr>
-              <w:t xml:space="preserve"> </w:t>
+              <w:t xml:space="preserve"> </w:t>
             </w:r>
             <w:r>
               <w:rPr>
@@ -7336,7 +7336,7 @@
               <w:rPr>
                 <w:u w:val="single"/>
               </w:rPr>
-              <w:t xml:space="preserve"> </w:t>
+              <w:t xml:space="preserve"> </w:t>
             </w:r>
             <w:r>
               <w:rPr>

</xml_diff>